<commit_message>
Modifications -Layperson -11 pages
Modifications -Layperson -11 pages
</commit_message>
<xml_diff>
--- a/Laypersons_Forensic_Observation_Report_FINAL.docx
+++ b/Laypersons_Forensic_Observation_Report_FINAL.docx
@@ -339,7 +339,7 @@
           <w:sz w:val="23"/>
           <w:szCs w:val="23"/>
         </w:rPr>
-        <w:t xml:space="preserve">Document R-1: Milkat Card (Property Card) No. 2026352962</w:t>
+        <w:t xml:space="preserve">Document J3-R-1: Milkat Card (Property Card) No. 2026352962</w:t>
       </w:r>
     </w:p>
     <w:p>
@@ -446,16 +446,16 @@
           <w:sz w:val="21"/>
           <w:szCs w:val="21"/>
         </w:rPr>
-        <w:t xml:space="preserve">Anomaly R-1(a) — Wrong owner in CERSAI vs. Revenue Record: </w:t>
-      </w:r>
-      <w:r>
-        <w:rPr>
-          <w:rFonts w:ascii="Arial" w:cs="Arial" w:eastAsia="Arial" w:hAnsi="Arial"/>
-          <w:color w:val="1F1F1F"/>
-          <w:sz w:val="21"/>
-          <w:szCs w:val="21"/>
-        </w:rPr>
-        <w:t xml:space="preserve">This Property Card shows the owner as Shri Maintainance Contract Pvt. Ltd. The CERSAI reports (Documents C-1 and C-2 below) show "Asset Owner: Yes" against M/s Rashmi Steels and M/s Light and Glaze Profile Pvt. Ltd. Both cannot be true simultaneously. Since the revenue record is a Government document bearing an official digital signature, and has shown the same owner consistently for 30+ years, I believe the CERSAI declarations are false. I request the authority to determine who submitted the ownership documents to the banks and to CERSAI, and what those documents were.</w:t>
+        <w:t xml:space="preserve">Anomaly J3-R-1(a) — Wrong owner in CERSAI vs. Revenue Record: </w:t>
+      </w:r>
+      <w:r>
+        <w:rPr>
+          <w:rFonts w:ascii="Arial" w:cs="Arial" w:eastAsia="Arial" w:hAnsi="Arial"/>
+          <w:color w:val="1F1F1F"/>
+          <w:sz w:val="21"/>
+          <w:szCs w:val="21"/>
+        </w:rPr>
+        <w:t xml:space="preserve">This Property Card shows the owner as Shri Maintainance Contract Pvt. Ltd. The CERSAI reports (Documents J3-C-1 and J3-C-2 below) show "Asset Owner: Yes" against M/s Rashmi Steels and M/s Light and Glaze Profile Pvt. Ltd. Both cannot be true simultaneously. Since the revenue record is a Government document bearing an official digital signature, and has shown the same owner consistently for 30+ years, I believe the CERSAI declarations are false. I request the authority to determine who submitted the ownership documents to the banks and to CERSAI, and what those documents were.</w:t>
       </w:r>
     </w:p>
     <w:p>
@@ -472,7 +472,7 @@
           <w:sz w:val="21"/>
           <w:szCs w:val="21"/>
         </w:rPr>
-        <w:t xml:space="preserve">Anomaly R-1(b) — Government revenue land mortgaged without apparent permission: </w:t>
+        <w:t xml:space="preserve">Anomaly J3-R-1(b) — Government revenue land mortgaged without apparent permission: </w:t>
       </w:r>
       <w:r>
         <w:rPr>
@@ -498,7 +498,7 @@
           <w:sz w:val="21"/>
           <w:szCs w:val="21"/>
         </w:rPr>
-        <w:t xml:space="preserve">Anomaly R-1(c) — Area discrepancy between revenue record and CERSAI: </w:t>
+        <w:t xml:space="preserve">Anomaly J3-R-1(c) — Area discrepancy between revenue record and CERSAI: </w:t>
       </w:r>
       <w:r>
         <w:rPr>
@@ -524,7 +524,7 @@
           <w:sz w:val="21"/>
           <w:szCs w:val="21"/>
         </w:rPr>
-        <w:t xml:space="preserve">Anomaly R-1(d) — Title by Government administrative order — not a sale deed: </w:t>
+        <w:t xml:space="preserve">Anomaly J3-R-1(d) — Title by Government administrative order — not a sale deed: </w:t>
       </w:r>
       <w:r>
         <w:rPr>
@@ -550,7 +550,7 @@
           <w:sz w:val="21"/>
           <w:szCs w:val="21"/>
         </w:rPr>
-        <w:t xml:space="preserve">Anomaly R-1(e) — Suspicious 2024 mutation while DRT case pending: </w:t>
+        <w:t xml:space="preserve">Anomaly J3-R-1(e) — Suspicious 2024 mutation while DRT case pending: </w:t>
       </w:r>
       <w:r>
         <w:rPr>
@@ -575,7 +575,7 @@
           <w:sz w:val="23"/>
           <w:szCs w:val="23"/>
         </w:rPr>
-        <w:t xml:space="preserve">Document R-2: Gaon Namuno No. 5 — Haq Patrak (Rights Record)</w:t>
+        <w:t xml:space="preserve">Document J3-R-2: Gaon Namuno No. 5 — Haq Patrak (Rights Record)</w:t>
       </w:r>
     </w:p>
     <w:p>
@@ -622,16 +622,16 @@
           <w:sz w:val="21"/>
           <w:szCs w:val="21"/>
         </w:rPr>
-        <w:t xml:space="preserve">Anomaly R-2(a) — No Bohra entity in 30 years of rights record: </w:t>
-      </w:r>
-      <w:r>
-        <w:rPr>
-          <w:rFonts w:ascii="Arial" w:cs="Arial" w:eastAsia="Arial" w:hAnsi="Arial"/>
-          <w:color w:val="1F1F1F"/>
-          <w:sz w:val="21"/>
-          <w:szCs w:val="21"/>
-        </w:rPr>
-        <w:t xml:space="preserve">This is consistent with the Property Card (Document R-1) — neither document shows any Bohra-connected ownership or rights.</w:t>
+        <w:t xml:space="preserve">Anomaly J3-R-2(a) — No Bohra entity in 30 years of rights record: </w:t>
+      </w:r>
+      <w:r>
+        <w:rPr>
+          <w:rFonts w:ascii="Arial" w:cs="Arial" w:eastAsia="Arial" w:hAnsi="Arial"/>
+          <w:color w:val="1F1F1F"/>
+          <w:sz w:val="21"/>
+          <w:szCs w:val="21"/>
+        </w:rPr>
+        <w:t xml:space="preserve">This is consistent with the Property Card (Document J3-R-1) — neither document shows any Bohra-connected ownership or rights.</w:t>
       </w:r>
     </w:p>
     <w:p>
@@ -648,7 +648,7 @@
           <w:sz w:val="21"/>
           <w:szCs w:val="21"/>
         </w:rPr>
-        <w:t xml:space="preserve">Anomaly R-2(b) — Record was current and available at time of BoI mortgage: </w:t>
+        <w:t xml:space="preserve">Anomaly J3-R-2(b) — Record was current and available at time of BoI mortgage: </w:t>
       </w:r>
       <w:r>
         <w:rPr>
@@ -674,7 +674,7 @@
           <w:sz w:val="21"/>
           <w:szCs w:val="21"/>
         </w:rPr>
-        <w:t xml:space="preserve">Anomaly R-2(c) — Non-sequential entry numbers: </w:t>
+        <w:t xml:space="preserve">Anomaly J3-R-2(c) — Non-sequential entry numbers: </w:t>
       </w:r>
       <w:r>
         <w:rPr>
@@ -699,7 +699,7 @@
           <w:sz w:val="23"/>
           <w:szCs w:val="23"/>
         </w:rPr>
-        <w:t xml:space="preserve">Document R-3: Gaon Namuno No. 12 — Occupancy and Cultivation Register</w:t>
+        <w:t xml:space="preserve">Document J3-R-3: Gaon Namuno No. 12 — Occupancy and Cultivation Register</w:t>
       </w:r>
     </w:p>
     <w:p>
@@ -731,7 +731,7 @@
           <w:sz w:val="21"/>
           <w:szCs w:val="21"/>
         </w:rPr>
-        <w:t xml:space="preserve">Anomaly R-3(a) — No Bohra entity as occupant: </w:t>
+        <w:t xml:space="preserve">Anomaly J3-R-3(a) — No Bohra entity as occupant: </w:t>
       </w:r>
       <w:r>
         <w:rPr>
@@ -756,7 +756,7 @@
           <w:sz w:val="23"/>
           <w:szCs w:val="23"/>
         </w:rPr>
-        <w:t xml:space="preserve">Document R-4: 7/12 Utara — RV 24g (II Size)</w:t>
+        <w:t xml:space="preserve">Document J3-R-4: 7/12 Utara — RV 24g (II Size)</w:t>
       </w:r>
     </w:p>
     <w:p>
@@ -788,7 +788,7 @@
           <w:sz w:val="21"/>
           <w:szCs w:val="21"/>
         </w:rPr>
-        <w:t xml:space="preserve">Anomaly R-4(a) — 7/12 confirms revenue record is consistent with Property Card: </w:t>
+        <w:t xml:space="preserve">Anomaly J3-R-4(a) — 7/12 confirms revenue record is consistent with Property Card: </w:t>
       </w:r>
       <w:r>
         <w:rPr>
@@ -814,7 +814,7 @@
           <w:sz w:val="21"/>
           <w:szCs w:val="21"/>
         </w:rPr>
-        <w:t xml:space="preserve">Anomaly R-4(b) — Encumbrance entries require expert examination: </w:t>
+        <w:t xml:space="preserve">Anomaly J3-R-4(b) — Encumbrance entries require expert examination: </w:t>
       </w:r>
       <w:r>
         <w:rPr>
@@ -875,7 +875,7 @@
           <w:sz w:val="23"/>
           <w:szCs w:val="23"/>
         </w:rPr>
-        <w:t xml:space="preserve">Document C-1: CERSAI Report — Asset ID 200003766496</w:t>
+        <w:t xml:space="preserve">Document J3-C-1: CERSAI Report — Asset ID 200003766496</w:t>
       </w:r>
     </w:p>
     <w:p>
@@ -907,7 +907,7 @@
           <w:sz w:val="21"/>
           <w:szCs w:val="21"/>
         </w:rPr>
-        <w:t xml:space="preserve">Anomaly C-1(a) — False "Asset Owner: Yes" declaration: </w:t>
+        <w:t xml:space="preserve">Anomaly J3-C-1(a) — False "Asset Owner: Yes" declaration: </w:t>
       </w:r>
       <w:r>
         <w:rPr>
@@ -933,7 +933,7 @@
           <w:sz w:val="21"/>
           <w:szCs w:val="21"/>
         </w:rPr>
-        <w:t xml:space="preserve">Anomaly C-1(b) — 13 years unsatisfied: </w:t>
+        <w:t xml:space="preserve">Anomaly J3-C-1(b) — 13 years unsatisfied: </w:t>
       </w:r>
       <w:r>
         <w:rPr>
@@ -959,7 +959,7 @@
           <w:sz w:val="21"/>
           <w:szCs w:val="21"/>
         </w:rPr>
-        <w:t xml:space="preserve">Anomaly C-1(c) — This charge was on CERSAI when BoI sanctioned ₹29.5 crore in 2017: </w:t>
+        <w:t xml:space="preserve">Anomaly J3-C-1(c) — This charge was on CERSAI when BoI sanctioned ₹29.5 crore in 2017: </w:t>
       </w:r>
       <w:r>
         <w:rPr>
@@ -984,7 +984,7 @@
           <w:sz w:val="23"/>
           <w:szCs w:val="23"/>
         </w:rPr>
-        <w:t xml:space="preserve">Document C-2: CERSAI Report — Asset ID 200014613560</w:t>
+        <w:t xml:space="preserve">Document J3-C-2: CERSAI Report — Asset ID 200014613560</w:t>
       </w:r>
     </w:p>
     <w:p>
@@ -1016,7 +1016,7 @@
           <w:sz w:val="21"/>
           <w:szCs w:val="21"/>
         </w:rPr>
-        <w:t xml:space="preserve">Anomaly C-2(a) — Same land, same false declaration, different non-owner: </w:t>
+        <w:t xml:space="preserve">Anomaly J3-C-2(a) — Same land, same false declaration, different non-owner: </w:t>
       </w:r>
       <w:r>
         <w:rPr>
@@ -1042,7 +1042,7 @@
           <w:sz w:val="21"/>
           <w:szCs w:val="21"/>
         </w:rPr>
-        <w:t xml:space="preserve">Anomaly C-2(b) — 410% increase in 5 years: </w:t>
+        <w:t xml:space="preserve">Anomaly J3-C-2(b) — 410% increase in 5 years: </w:t>
       </w:r>
       <w:r>
         <w:rPr>
@@ -1068,7 +1068,7 @@
           <w:sz w:val="21"/>
           <w:szCs w:val="21"/>
         </w:rPr>
-        <w:t xml:space="preserve">Anomaly C-2(c) — Two different CERSAI Asset IDs for the same physical land: </w:t>
+        <w:t xml:space="preserve">Anomaly J3-C-2(c) — Two different CERSAI Asset IDs for the same physical land: </w:t>
       </w:r>
       <w:r>
         <w:rPr>
@@ -1094,7 +1094,7 @@
           <w:sz w:val="21"/>
           <w:szCs w:val="21"/>
         </w:rPr>
-        <w:t xml:space="preserve">Anomaly C-2(d) — Pin code discrepancy: </w:t>
+        <w:t xml:space="preserve">Anomaly J3-C-2(d) — Pin code discrepancy: </w:t>
       </w:r>
       <w:r>
         <w:rPr>
@@ -1120,7 +1120,7 @@
           <w:sz w:val="21"/>
           <w:szCs w:val="21"/>
         </w:rPr>
-        <w:t xml:space="preserve">Anomaly C-2(e) — Now confirmed Government revenue land — doubly void: </w:t>
+        <w:t xml:space="preserve">Anomaly J3-C-2(e) — Now confirmed Government revenue land — doubly void: </w:t>
       </w:r>
       <w:r>
         <w:rPr>
@@ -1145,7 +1145,7 @@
           <w:sz w:val="23"/>
           <w:szCs w:val="23"/>
         </w:rPr>
-        <w:t xml:space="preserve">Document C-3, C-4, C-5: CERSAI Report — Asset ID 200015123404 (Plot 523 / 555 / 561)</w:t>
+        <w:t xml:space="preserve">Document J3-C-3, J3-C-4, J3-C-5: CERSAI Report — Asset ID 200015123404 (Plot 523 / 555 / 561)</w:t>
       </w:r>
     </w:p>
     <w:p>
@@ -1177,7 +1177,7 @@
           <w:sz w:val="21"/>
           <w:szCs w:val="21"/>
         </w:rPr>
-        <w:t xml:space="preserve">Anomaly C-3(a) — Enhancement after default: </w:t>
+        <w:t xml:space="preserve">Anomaly J3-C-3(a) — Enhancement after default: </w:t>
       </w:r>
       <w:r>
         <w:rPr>
@@ -1203,7 +1203,7 @@
           <w:sz w:val="21"/>
           <w:szCs w:val="21"/>
         </w:rPr>
-        <w:t xml:space="preserve">Anomaly C-3(b) — Same branch, same proprietor, related entity: </w:t>
+        <w:t xml:space="preserve">Anomaly J3-C-3(b) — Same branch, same proprietor, related entity: </w:t>
       </w:r>
       <w:r>
         <w:rPr>
@@ -1229,7 +1229,7 @@
           <w:sz w:val="21"/>
           <w:szCs w:val="21"/>
         </w:rPr>
-        <w:t xml:space="preserve">Anomaly C-3(c)/(4a)/(5a) — Three plot numbers, same asset — reproducible across three separate searches: </w:t>
+        <w:t xml:space="preserve">Anomaly J3-C-3(c)/(4a)/(5a) — Three plot numbers, same asset — reproducible across three separate searches: </w:t>
       </w:r>
       <w:r>
         <w:rPr>
@@ -1254,7 +1254,7 @@
           <w:sz w:val="23"/>
           <w:szCs w:val="23"/>
         </w:rPr>
-        <w:t xml:space="preserve">Document C-6 to C-10: Comparative/transparency records (Kasindra survey cluster)</w:t>
+        <w:t xml:space="preserve">Document J3-C-6 to J3-C-10: Comparative/transparency records (Kasindra survey cluster)</w:t>
       </w:r>
     </w:p>
     <w:p>
@@ -1286,7 +1286,7 @@
           <w:sz w:val="21"/>
           <w:szCs w:val="21"/>
         </w:rPr>
-        <w:t xml:space="preserve">Anomaly C-8(a) — Useful baseline comparison: </w:t>
+        <w:t xml:space="preserve">Anomaly J3-C-8(a) — Useful baseline comparison: </w:t>
       </w:r>
       <w:r>
         <w:rPr>
@@ -1312,7 +1312,7 @@
           <w:sz w:val="21"/>
           <w:szCs w:val="21"/>
         </w:rPr>
-        <w:t xml:space="preserve">Anomaly C-10(a) — 7-month delay in CERSAI registration by Bank of India: </w:t>
+        <w:t xml:space="preserve">Anomaly J3-C-10(a) — 7-month delay in CERSAI registration by Bank of India: </w:t>
       </w:r>
       <w:r>
         <w:rPr>
@@ -1337,7 +1337,7 @@
           <w:sz w:val="23"/>
           <w:szCs w:val="23"/>
         </w:rPr>
-        <w:t xml:space="preserve">Document C-11: CERSAI Report — Asset ID 200017457156</w:t>
+        <w:t xml:space="preserve">Document J3-C-11: CERSAI Report — Asset ID 200017457156</w:t>
       </w:r>
     </w:p>
     <w:p>
@@ -1369,7 +1369,7 @@
           <w:sz w:val="21"/>
           <w:szCs w:val="21"/>
         </w:rPr>
-        <w:t xml:space="preserve">Anomaly C-11(a) — Same-day 16-minute enhancement: </w:t>
+        <w:t xml:space="preserve">Anomaly J3-C-11(a) — Same-day 16-minute enhancement: </w:t>
       </w:r>
       <w:r>
         <w:rPr>
@@ -1395,7 +1395,7 @@
           <w:sz w:val="21"/>
           <w:szCs w:val="21"/>
         </w:rPr>
-        <w:t xml:space="preserve">Anomaly C-11(b) — ₹44+ crore from one branch to one family in one year: </w:t>
+        <w:t xml:space="preserve">Anomaly J3-C-11(b) — ₹44+ crore from one branch to one family in one year: </w:t>
       </w:r>
       <w:r>
         <w:rPr>
@@ -1420,7 +1420,7 @@
           <w:sz w:val="23"/>
           <w:szCs w:val="23"/>
         </w:rPr>
-        <w:t xml:space="preserve">Document C-12: CERSAI Debtor Search — Ravi Babulal Bohra (PAN: ANWPB3324M)</w:t>
+        <w:t xml:space="preserve">Document J3-C-12: CERSAI Debtor Search — Ravi Babulal Bohra (PAN: ANWPB3324M)</w:t>
       </w:r>
     </w:p>
     <w:p>
@@ -1452,7 +1452,7 @@
           <w:sz w:val="21"/>
           <w:szCs w:val="21"/>
         </w:rPr>
-        <w:t xml:space="preserve">Anomaly C-12(a) — Son's loan classified NPA — confirms family-wide financial default: </w:t>
+        <w:t xml:space="preserve">Anomaly J3-C-12(a) — Son's loan classified NPA — confirms family-wide financial default: </w:t>
       </w:r>
       <w:r>
         <w:rPr>
@@ -1478,7 +1478,7 @@
           <w:sz w:val="21"/>
           <w:szCs w:val="21"/>
         </w:rPr>
-        <w:t xml:space="preserve">Anomaly C-12(b) — Missing assets — nominee holding suspected: </w:t>
+        <w:t xml:space="preserve">Anomaly J3-C-12(b) — Missing assets — nominee holding suspected: </w:t>
       </w:r>
       <w:r>
         <w:rPr>
@@ -1522,7 +1522,7 @@
           <w:sz w:val="23"/>
           <w:szCs w:val="23"/>
         </w:rPr>
-        <w:t xml:space="preserve">Document M-1: MCA Portal Printout — Shri Maintainance Contract Pvt. Ltd.</w:t>
+        <w:t xml:space="preserve">Document J3-M-1: MCA Portal Printout — Shri Maintainance Contract Pvt. Ltd.</w:t>
       </w:r>
     </w:p>
     <w:p>
@@ -1554,7 +1554,7 @@
           <w:sz w:val="21"/>
           <w:szCs w:val="21"/>
         </w:rPr>
-        <w:t xml:space="preserve">Anomaly M-1(a) — Land owner is legally dead: </w:t>
+        <w:t xml:space="preserve">Anomaly J3-M-1(a) — Land owner is legally dead: </w:t>
       </w:r>
       <w:r>
         <w:rPr>
@@ -1580,7 +1580,7 @@
           <w:sz w:val="21"/>
           <w:szCs w:val="21"/>
         </w:rPr>
-        <w:t xml:space="preserve">Anomaly M-1(b) — RTI filed — response awaited: </w:t>
+        <w:t xml:space="preserve">Anomaly J3-M-1(b) — RTI filed — response awaited: </w:t>
       </w:r>
       <w:r>
         <w:rPr>
@@ -1605,7 +1605,7 @@
           <w:sz w:val="23"/>
           <w:szCs w:val="23"/>
         </w:rPr>
-        <w:t xml:space="preserve">Document D-1: DRT Portal Screenshots — OA/122/2022</w:t>
+        <w:t xml:space="preserve">Document J3-D-1: DRT Portal Screenshots — OA/122/2022</w:t>
       </w:r>
     </w:p>
     <w:p>
@@ -1637,7 +1637,7 @@
           <w:sz w:val="21"/>
           <w:szCs w:val="21"/>
         </w:rPr>
-        <w:t xml:space="preserve">Anomaly D-1(a) — Service at an address Bank of India itself had vacated: </w:t>
+        <w:t xml:space="preserve">Anomaly J3-D-1(a) — Service at an address Bank of India itself had vacated: </w:t>
       </w:r>
       <w:r>
         <w:rPr>
@@ -1663,7 +1663,7 @@
           <w:sz w:val="21"/>
           <w:szCs w:val="21"/>
         </w:rPr>
-        <w:t xml:space="preserve">Anomaly D-1(b) — Mrs. Geetaben B. Joshi not named in DRT but named in auction notice: </w:t>
+        <w:t xml:space="preserve">Anomaly J3-D-1(b) — Mrs. Geetaben B. Joshi not named in DRT but named in auction notice: </w:t>
       </w:r>
       <w:r>
         <w:rPr>
@@ -1688,7 +1688,7 @@
           <w:sz w:val="23"/>
           <w:szCs w:val="23"/>
         </w:rPr>
-        <w:t xml:space="preserve">Document D-2: DRT Cause List — 06-02-2024</w:t>
+        <w:t xml:space="preserve">Document J3-D-2: DRT Cause List — 06-02-2024</w:t>
       </w:r>
     </w:p>
     <w:p>
@@ -1720,7 +1720,7 @@
           <w:sz w:val="21"/>
           <w:szCs w:val="21"/>
         </w:rPr>
-        <w:t xml:space="preserve">Anomaly D-2(a) — Separate OA against son confirms father and son separately liable: </w:t>
+        <w:t xml:space="preserve">Anomaly J3-D-2(a) — Separate OA against son confirms father and son separately liable: </w:t>
       </w:r>
       <w:r>
         <w:rPr>
@@ -1764,7 +1764,7 @@
           <w:sz w:val="23"/>
           <w:szCs w:val="23"/>
         </w:rPr>
-        <w:t xml:space="preserve">Document N-1: Bank of India E-Auction Notice</w:t>
+        <w:t xml:space="preserve">Document J3-N-1: Bank of India E-Auction Notice</w:t>
       </w:r>
     </w:p>
     <w:p>
@@ -1796,7 +1796,7 @@
           <w:sz w:val="21"/>
           <w:szCs w:val="21"/>
         </w:rPr>
-        <w:t xml:space="preserve">Anomaly N-1(a) — Bank of India conducted SARFAESI on the basis of a void mortgage: </w:t>
+        <w:t xml:space="preserve">Anomaly J3-N-1(a) — Bank of India conducted SARFAESI on the basis of a void mortgage: </w:t>
       </w:r>
       <w:r>
         <w:rPr>
@@ -1822,7 +1822,7 @@
           <w:sz w:val="21"/>
           <w:szCs w:val="21"/>
         </w:rPr>
-        <w:t xml:space="preserve">Anomaly N-1(b) — Outstanding of ₹26.97 crore three and a half years after disbursement: </w:t>
+        <w:t xml:space="preserve">Anomaly J3-N-1(b) — Outstanding of ₹26.97 crore three and a half years after disbursement: </w:t>
       </w:r>
       <w:r>
         <w:rPr>
@@ -1848,7 +1848,7 @@
           <w:sz w:val="21"/>
           <w:szCs w:val="21"/>
         </w:rPr>
-        <w:t xml:space="preserve">Anomaly N-1(c) — New guarantor Mrs. Geetaben B. Joshi — untraced assets: </w:t>
+        <w:t xml:space="preserve">Anomaly J3-N-1(c) — New guarantor Mrs. Geetaben B. Joshi — untraced assets: </w:t>
       </w:r>
       <w:r>
         <w:rPr>
@@ -1892,7 +1892,7 @@
           <w:sz w:val="23"/>
           <w:szCs w:val="23"/>
         </w:rPr>
-        <w:t xml:space="preserve">Document T-1: RTI Application Receipt</w:t>
+        <w:t xml:space="preserve">Document J3-T-1: RTI Application Receipt</w:t>
       </w:r>
     </w:p>
     <w:p>
@@ -1924,7 +1924,7 @@
           <w:sz w:val="21"/>
           <w:szCs w:val="21"/>
         </w:rPr>
-        <w:t xml:space="preserve">Anomaly T-1(a) — Director identity is the missing link: </w:t>
+        <w:t xml:space="preserve">Anomaly J3-T-1(a) — Director identity is the missing link: </w:t>
       </w:r>
       <w:r>
         <w:rPr>
@@ -3186,7 +3186,7 @@
                 <w:sz w:val="16"/>
                 <w:szCs w:val="16"/>
               </w:rPr>
-              <w:t xml:space="preserve">R-1(a)</w:t>
+              <w:t xml:space="preserve">J3-R-1(a)</w:t>
             </w:r>
           </w:p>
         </w:tc>
@@ -3307,7 +3307,7 @@
                 <w:sz w:val="16"/>
                 <w:szCs w:val="16"/>
               </w:rPr>
-              <w:t xml:space="preserve">R-1(b)</w:t>
+              <w:t xml:space="preserve">J3-R-1(b)</w:t>
             </w:r>
           </w:p>
         </w:tc>
@@ -3426,7 +3426,7 @@
                 <w:sz w:val="16"/>
                 <w:szCs w:val="16"/>
               </w:rPr>
-              <w:t xml:space="preserve">R-1(c)</w:t>
+              <w:t xml:space="preserve">J3-R-1(c)</w:t>
             </w:r>
           </w:p>
         </w:tc>
@@ -3547,7 +3547,7 @@
                 <w:sz w:val="16"/>
                 <w:szCs w:val="16"/>
               </w:rPr>
-              <w:t xml:space="preserve">R-1(d)</w:t>
+              <w:t xml:space="preserve">J3-R-1(d)</w:t>
             </w:r>
           </w:p>
         </w:tc>
@@ -3666,7 +3666,7 @@
                 <w:sz w:val="16"/>
                 <w:szCs w:val="16"/>
               </w:rPr>
-              <w:t xml:space="preserve">R-1(e)</w:t>
+              <w:t xml:space="preserve">J3-R-1(e)</w:t>
             </w:r>
           </w:p>
         </w:tc>
@@ -3787,7 +3787,7 @@
                 <w:sz w:val="16"/>
                 <w:szCs w:val="16"/>
               </w:rPr>
-              <w:t xml:space="preserve">R-2(a)</w:t>
+              <w:t xml:space="preserve">J3-R-2(a)</w:t>
             </w:r>
           </w:p>
         </w:tc>
@@ -3906,7 +3906,7 @@
                 <w:sz w:val="16"/>
                 <w:szCs w:val="16"/>
               </w:rPr>
-              <w:t xml:space="preserve">R-2(b)</w:t>
+              <w:t xml:space="preserve">J3-R-2(b)</w:t>
             </w:r>
           </w:p>
         </w:tc>
@@ -4027,7 +4027,7 @@
                 <w:sz w:val="16"/>
                 <w:szCs w:val="16"/>
               </w:rPr>
-              <w:t xml:space="preserve">R-2(c)</w:t>
+              <w:t xml:space="preserve">J3-R-2(c)</w:t>
             </w:r>
           </w:p>
         </w:tc>
@@ -4146,7 +4146,7 @@
                 <w:sz w:val="16"/>
                 <w:szCs w:val="16"/>
               </w:rPr>
-              <w:t xml:space="preserve">R-3(a)</w:t>
+              <w:t xml:space="preserve">J3-R-3(a)</w:t>
             </w:r>
           </w:p>
         </w:tc>
@@ -4267,7 +4267,7 @@
                 <w:sz w:val="16"/>
                 <w:szCs w:val="16"/>
               </w:rPr>
-              <w:t xml:space="preserve">R-4(a)</w:t>
+              <w:t xml:space="preserve">J3-R-4(a)</w:t>
             </w:r>
           </w:p>
         </w:tc>
@@ -4386,7 +4386,7 @@
                 <w:sz w:val="16"/>
                 <w:szCs w:val="16"/>
               </w:rPr>
-              <w:t xml:space="preserve">R-4(b)</w:t>
+              <w:t xml:space="preserve">J3-R-4(b)</w:t>
             </w:r>
           </w:p>
         </w:tc>
@@ -4507,7 +4507,7 @@
                 <w:sz w:val="16"/>
                 <w:szCs w:val="16"/>
               </w:rPr>
-              <w:t xml:space="preserve">C-1(a)</w:t>
+              <w:t xml:space="preserve">J3-C-1(a)</w:t>
             </w:r>
           </w:p>
         </w:tc>
@@ -4594,7 +4594,7 @@
                 <w:sz w:val="16"/>
                 <w:szCs w:val="16"/>
               </w:rPr>
-              <w:t xml:space="preserve">No title — proved by R-1 to R-4</w:t>
+              <w:t xml:space="preserve">No title — proved by J3-R-1 to J3-R-4</w:t>
             </w:r>
           </w:p>
         </w:tc>
@@ -4626,7 +4626,7 @@
                 <w:sz w:val="16"/>
                 <w:szCs w:val="16"/>
               </w:rPr>
-              <w:t xml:space="preserve">C-1(b)</w:t>
+              <w:t xml:space="preserve">J3-C-1(b)</w:t>
             </w:r>
           </w:p>
         </w:tc>
@@ -4747,7 +4747,7 @@
                 <w:sz w:val="16"/>
                 <w:szCs w:val="16"/>
               </w:rPr>
-              <w:t xml:space="preserve">C-1(c)</w:t>
+              <w:t xml:space="preserve">J3-C-1(c)</w:t>
             </w:r>
           </w:p>
         </w:tc>
@@ -4866,7 +4866,7 @@
                 <w:sz w:val="16"/>
                 <w:szCs w:val="16"/>
               </w:rPr>
-              <w:t xml:space="preserve">C-2(a)</w:t>
+              <w:t xml:space="preserve">J3-C-2(a)</w:t>
             </w:r>
           </w:p>
         </w:tc>
@@ -4956,7 +4956,7 @@
                 <w:sz w:val="16"/>
                 <w:szCs w:val="16"/>
               </w:rPr>
-              <w:t xml:space="preserve">No title — proved by R-1 to R-4</w:t>
+              <w:t xml:space="preserve">No title — proved by J3-R-1 to J3-R-4</w:t>
             </w:r>
           </w:p>
         </w:tc>
@@ -4987,7 +4987,7 @@
                 <w:sz w:val="16"/>
                 <w:szCs w:val="16"/>
               </w:rPr>
-              <w:t xml:space="preserve">C-2(b)</w:t>
+              <w:t xml:space="preserve">J3-C-2(b)</w:t>
             </w:r>
           </w:p>
         </w:tc>
@@ -5106,7 +5106,7 @@
                 <w:sz w:val="16"/>
                 <w:szCs w:val="16"/>
               </w:rPr>
-              <w:t xml:space="preserve">C-2(c)</w:t>
+              <w:t xml:space="preserve">J3-C-2(c)</w:t>
             </w:r>
           </w:p>
         </w:tc>
@@ -5227,7 +5227,7 @@
                 <w:sz w:val="16"/>
                 <w:szCs w:val="16"/>
               </w:rPr>
-              <w:t xml:space="preserve">C-2(d)</w:t>
+              <w:t xml:space="preserve">J3-C-2(d)</w:t>
             </w:r>
           </w:p>
         </w:tc>
@@ -5346,7 +5346,7 @@
                 <w:sz w:val="16"/>
                 <w:szCs w:val="16"/>
               </w:rPr>
-              <w:t xml:space="preserve">C-2(e)</w:t>
+              <w:t xml:space="preserve">J3-C-2(e)</w:t>
             </w:r>
           </w:p>
         </w:tc>
@@ -5467,7 +5467,7 @@
                 <w:sz w:val="16"/>
                 <w:szCs w:val="16"/>
               </w:rPr>
-              <w:t xml:space="preserve">C-3(a)</w:t>
+              <w:t xml:space="preserve">J3-C-3(a)</w:t>
             </w:r>
           </w:p>
         </w:tc>
@@ -5586,7 +5586,7 @@
                 <w:sz w:val="16"/>
                 <w:szCs w:val="16"/>
               </w:rPr>
-              <w:t xml:space="preserve">C-3(b)</w:t>
+              <w:t xml:space="preserve">J3-C-3(b)</w:t>
             </w:r>
           </w:p>
         </w:tc>
@@ -5707,7 +5707,7 @@
                 <w:sz w:val="16"/>
                 <w:szCs w:val="16"/>
               </w:rPr>
-              <w:t xml:space="preserve">C-5(a)</w:t>
+              <w:t xml:space="preserve">J3-C-5(a)</w:t>
             </w:r>
           </w:p>
         </w:tc>
@@ -5826,7 +5826,7 @@
                 <w:sz w:val="16"/>
                 <w:szCs w:val="16"/>
               </w:rPr>
-              <w:t xml:space="preserve">C-10(a)</w:t>
+              <w:t xml:space="preserve">J3-C-10(a)</w:t>
             </w:r>
           </w:p>
         </w:tc>
@@ -5856,7 +5856,7 @@
                 <w:sz w:val="16"/>
                 <w:szCs w:val="16"/>
               </w:rPr>
-              <w:t xml:space="preserve">CERSAI C-10</w:t>
+              <w:t xml:space="preserve">CERSAI J3-C-10</w:t>
             </w:r>
           </w:p>
         </w:tc>
@@ -5947,7 +5947,7 @@
                 <w:sz w:val="16"/>
                 <w:szCs w:val="16"/>
               </w:rPr>
-              <w:t xml:space="preserve">C-11(a)</w:t>
+              <w:t xml:space="preserve">J3-C-11(a)</w:t>
             </w:r>
           </w:p>
         </w:tc>
@@ -5976,7 +5976,7 @@
                 <w:sz w:val="16"/>
                 <w:szCs w:val="16"/>
               </w:rPr>
-              <w:t xml:space="preserve">CERSAI C-11</w:t>
+              <w:t xml:space="preserve">CERSAI J3-C-11</w:t>
             </w:r>
           </w:p>
         </w:tc>
@@ -6066,7 +6066,7 @@
                 <w:sz w:val="16"/>
                 <w:szCs w:val="16"/>
               </w:rPr>
-              <w:t xml:space="preserve">C-11(b)</w:t>
+              <w:t xml:space="preserve">J3-C-11(b)</w:t>
             </w:r>
           </w:p>
         </w:tc>
@@ -6096,7 +6096,7 @@
                 <w:sz w:val="16"/>
                 <w:szCs w:val="16"/>
               </w:rPr>
-              <w:t xml:space="preserve">CERSAI C-11</w:t>
+              <w:t xml:space="preserve">CERSAI J3-C-11</w:t>
             </w:r>
           </w:p>
         </w:tc>
@@ -6187,7 +6187,7 @@
                 <w:sz w:val="16"/>
                 <w:szCs w:val="16"/>
               </w:rPr>
-              <w:t xml:space="preserve">C-12(a)</w:t>
+              <w:t xml:space="preserve">J3-C-12(a)</w:t>
             </w:r>
           </w:p>
         </w:tc>
@@ -6216,7 +6216,7 @@
                 <w:sz w:val="16"/>
                 <w:szCs w:val="16"/>
               </w:rPr>
-              <w:t xml:space="preserve">CERSAI C-12</w:t>
+              <w:t xml:space="preserve">CERSAI J3-C-12</w:t>
             </w:r>
           </w:p>
         </w:tc>
@@ -6306,7 +6306,7 @@
                 <w:sz w:val="16"/>
                 <w:szCs w:val="16"/>
               </w:rPr>
-              <w:t xml:space="preserve">C-12(b)</w:t>
+              <w:t xml:space="preserve">J3-C-12(b)</w:t>
             </w:r>
           </w:p>
         </w:tc>
@@ -6336,7 +6336,7 @@
                 <w:sz w:val="16"/>
                 <w:szCs w:val="16"/>
               </w:rPr>
-              <w:t xml:space="preserve">CERSAI C-12</w:t>
+              <w:t xml:space="preserve">CERSAI J3-C-12</w:t>
             </w:r>
           </w:p>
         </w:tc>
@@ -6427,7 +6427,7 @@
                 <w:sz w:val="16"/>
                 <w:szCs w:val="16"/>
               </w:rPr>
-              <w:t xml:space="preserve">M-1(a)</w:t>
+              <w:t xml:space="preserve">J3-M-1(a)</w:t>
             </w:r>
           </w:p>
         </w:tc>
@@ -6546,7 +6546,7 @@
                 <w:sz w:val="16"/>
                 <w:szCs w:val="16"/>
               </w:rPr>
-              <w:t xml:space="preserve">M-1(b)</w:t>
+              <w:t xml:space="preserve">J3-M-1(b)</w:t>
             </w:r>
           </w:p>
         </w:tc>
@@ -6667,7 +6667,7 @@
                 <w:sz w:val="16"/>
                 <w:szCs w:val="16"/>
               </w:rPr>
-              <w:t xml:space="preserve">D-1(a)</w:t>
+              <w:t xml:space="preserve">J3-D-1(a)</w:t>
             </w:r>
           </w:p>
         </w:tc>
@@ -6786,7 +6786,7 @@
                 <w:sz w:val="16"/>
                 <w:szCs w:val="16"/>
               </w:rPr>
-              <w:t xml:space="preserve">D-1(b)</w:t>
+              <w:t xml:space="preserve">J3-D-1(b)</w:t>
             </w:r>
           </w:p>
         </w:tc>
@@ -6907,7 +6907,7 @@
                 <w:sz w:val="16"/>
                 <w:szCs w:val="16"/>
               </w:rPr>
-              <w:t xml:space="preserve">D-2(a)</w:t>
+              <w:t xml:space="preserve">J3-D-2(a)</w:t>
             </w:r>
           </w:p>
         </w:tc>
@@ -7026,7 +7026,7 @@
                 <w:sz w:val="16"/>
                 <w:szCs w:val="16"/>
               </w:rPr>
-              <w:t xml:space="preserve">N-1(a)</w:t>
+              <w:t xml:space="preserve">J3-N-1(a)</w:t>
             </w:r>
           </w:p>
         </w:tc>
@@ -7147,7 +7147,7 @@
                 <w:sz w:val="16"/>
                 <w:szCs w:val="16"/>
               </w:rPr>
-              <w:t xml:space="preserve">N-1(b)</w:t>
+              <w:t xml:space="preserve">J3-N-1(b)</w:t>
             </w:r>
           </w:p>
         </w:tc>
@@ -7266,7 +7266,7 @@
                 <w:sz w:val="16"/>
                 <w:szCs w:val="16"/>
               </w:rPr>
-              <w:t xml:space="preserve">N-1(c)</w:t>
+              <w:t xml:space="preserve">J3-N-1(c)</w:t>
             </w:r>
           </w:p>
         </w:tc>
@@ -7387,7 +7387,7 @@
                 <w:sz w:val="16"/>
                 <w:szCs w:val="16"/>
               </w:rPr>
-              <w:t xml:space="preserve">T-1(a)</w:t>
+              <w:t xml:space="preserve">J3-T-1(a)</w:t>
             </w:r>
           </w:p>
         </w:tc>

</xml_diff>